<commit_message>
Export: aktualisierte 12x19 cm Taschenbuch-Lesefassung
</commit_message>
<xml_diff>
--- a/export/Die_Glocken_von_Dornwacht.docx
+++ b/export/Die_Glocken_von_Dornwacht.docx
@@ -83,47 +83,103 @@
         <w:jc w:val="both"/>
       </w:pPr>
       <w:r>
-        <w:t>Hunger hatte sie kennengelernt, bevor sie alt genug gewesen war, das Wort Ungerechtigkeit zu verstehen. Und Angst. In jener Nacht hatten sie sie in einer Gasse liegen lassen, weil sie nicht mehr aufstand. Der Regen rann zwischen den Pflastersteinen hindurch. Jeder Atemzug schmerzte. Sie wusste nicht, ob sie den Morgen erleben würde. Dann waren die Ratten gekommen.</w:t>
-      </w:r>
-    </w:p>
-    <w:p>
-      <w:pPr>
-        <w:jc w:val="both"/>
-      </w:pPr>
-      <w:r>
-        <w:t>Zuerst eine, die unter einem Stapel zerbrochener Kisten hervorkroch. Dann zwei weitere. Bald bewegte sich der Unrat rings um sie, als hätte die Gasse selbst zu atmen begonnen. Skarra hatte keinen Zauberspruch gekannt. Keinen Lehrer gehabt. Sie hatte nur gewollt, dass die Männer verschwanden. Dass sie aufhörten. Dass sie sie niemals wieder anfassten.</w:t>
-      </w:r>
-    </w:p>
-    <w:p>
-      <w:pPr>
-        <w:jc w:val="both"/>
-      </w:pPr>
-      <w:r>
-        <w:t>Etwas Kaltes war in ihr erwacht und hatte auf diesen Wunsch geantwortet. Die Ratten erhoben sich gegen ihre Peiniger. Die Männer flohen. Am nächsten Morgen fand man zwei von ihnen tot, ohne sichtbare Wunden und mit Gesichtern, auf denen sich das Entsetzen festgesetzt hatte. Skarra hatte damals nicht verstanden, was sie getan hatte. Später verstand sie mehr.</w:t>
-      </w:r>
-    </w:p>
-    <w:p>
-      <w:pPr>
-        <w:jc w:val="both"/>
-      </w:pPr>
-      <w:r>
-        <w:t>Nicht alles. Die Gabe ließ sich formen. Sie konnte den Tod berühren, wo andere nur sein Ende sahen. Sie lernte aus Versuch und Irrtum, aus Instinkt und einer Wut, die jahrelang keinen Grund fand zu erlöschen. Sie kehrte zu den Menschen zurück, die sie und andere Kinder gequält hatten. Einer nach dem anderen.</w:t>
-      </w:r>
-    </w:p>
-    <w:p>
-      <w:pPr>
-        <w:jc w:val="both"/>
-      </w:pPr>
-      <w:r>
-        <w:t>Sie ließ Schatten in ihren Häusern wachsen und ihre Opfer von Stimmen heimsuchen, die längst hätten schweigen sollen. Manche starben. Andere wünschten es sich, lange bevor es geschah. Es war Rache, und irgendwann war sie weit mehr als das. In den Gassen begann man einen Namen zu flüstern. Schwarzherz.</w:t>
-      </w:r>
-    </w:p>
-    <w:p>
-      <w:pPr>
-        <w:jc w:val="both"/>
-      </w:pPr>
-      <w:r>
-        <w:t>Zuerst hatte sie ihn als Drohung verstanden, die nun endlich von ihr ausging statt gegen sie gerichtet zu sein. Doch Namen hatten die unangenehme Eigenschaft, an einem haften zu bleiben. Und dieser begann eine Frage zu stellen, die sie nicht hören wollte: Wann war aus dem gejagten Kind jemand geworden, vor dem andere Kinder Angst haben mussten? Die Antwort kam mit einem Jungen.</w:t>
+        <w:t>Hunger hatte sie kennengelernt, bevor sie alt genug gewesen war, das Wort Ungerechtigkeit zu verstehen. Und Angst. In jener Nacht hatten sie sie in einer Gasse liegen lassen, weil sie nicht mehr aufstand. Der Regen rann zwischen den Pflastersteinen hindurch. Jeder Atemzug schmerzte. Sie wusste nicht, ob sie den Morgen erleben würde. Zuerst hatte sie nur das Rascheln gehört.</w:t>
+      </w:r>
+    </w:p>
+    <w:p>
+      <w:pPr>
+        <w:jc w:val="both"/>
+      </w:pPr>
+      <w:r>
+        <w:t>Ratten. Sie kamen aus den Ritzen zwischen den Mauern, aus dem Unrat und den Abflussrinnen. Kleine, hungrige Geschöpfe, die sich gewöhnlich von Menschen fernhielten. Dann geschah etwas. Skarra hatte keinen Zauberspruch gesprochen. Sie hatte nicht einmal gewusst, dass sie zu Magie fähig war. Sie hatte nur daliegen und sterben wollen – und zugleich mit jeder Faser ihres geschundenen Körpers dagegen angekämpft.</w:t>
+      </w:r>
+    </w:p>
+    <w:p>
+      <w:pPr>
+        <w:jc w:val="both"/>
+      </w:pPr>
+      <w:r>
+        <w:t>Etwas Kaltes erwachte in ihr. Die erste Ratte brach zusammen. Dann eine zweite. Eine dritte. Ihre kleinen Körper zuckten, als würde etwas Unsichtbares an ihnen zerren, bevor sie reglos zwischen den Pflastersteinen liegen blieben. Und Skarra spürte, wie etwas in sie hineinströmte. Wärme. Kraft. Leben.</w:t>
+      </w:r>
+    </w:p>
+    <w:p>
+      <w:pPr>
+        <w:jc w:val="both"/>
+      </w:pPr>
+      <w:r>
+        <w:t>Es fühlte sich gut an. Mehr noch. Es war ein überwältigendes Gefühl. Der Schmerz trat zurück, die Kälte wich aus ihren Gliedern, und zum ersten Mal seit Stunden hatte sie nicht das Gefühl, sterben zu müssen. Sie klammerte sich daran. Wollte es festhalten.</w:t>
+      </w:r>
+    </w:p>
+    <w:p>
+      <w:pPr>
+        <w:jc w:val="both"/>
+      </w:pPr>
+      <w:r>
+        <w:t>Wollte mehr. Und ohne zu begreifen, was sie tat, begann sie zu ziehen. Die letzten Ratten verendeten zwischen den Pflastersteinen. Doch das Gefühl ließ bereits nach. Skarra wollte nicht, dass es aufhörte. Nicht jetzt. Nicht, nachdem sie endlich wieder spürte, wie es war, am Leben zu sein. Also zog sie weiter.</w:t>
+      </w:r>
+    </w:p>
+    <w:p>
+      <w:pPr>
+        <w:jc w:val="both"/>
+      </w:pPr>
+      <w:r>
+        <w:t>Dann griff die Macht nach etwas Größerem. Einer der Männer, die sie zusammengeschlagen hatten, blieb mitten in der Bewegung stehen. Er fasste sich an die Brust, öffnete den Mund und brachte keinen Laut hervor. Der zweite taumelte zurück. Und plötzlich war da so viel mehr.</w:t>
+      </w:r>
+    </w:p>
+    <w:p>
+      <w:pPr>
+        <w:jc w:val="both"/>
+      </w:pPr>
+      <w:r>
+        <w:t>Skarra spürte den gewaltigen Strom fremder Lebenskraft, der sie durchflutete. Für einen Augenblick verschwanden Angst und Schmerz hinter einem berauschenden Gefühl von Stärke. Dann sah sie den ersten Mann auf die Knie fallen. Etwas in ihr erschrak. Sie wollte aufhören.</w:t>
+      </w:r>
+    </w:p>
+    <w:p>
+      <w:pPr>
+        <w:jc w:val="both"/>
+      </w:pPr>
+      <w:r>
+        <w:t>Aber sie wusste nicht, wie. Der zweite Mann versuchte zu fliehen. Er schaffte nur wenige Schritte, bevor auch er auf dem nassen Pflaster zusammenbrach. Skarra lag zwischen den toten Ratten und den reglosen Männern. Ihr Atem ging stoßweise. Sie verstand nicht, was geschehen war. Nur eines wusste sie: Eben noch hatte sie im Sterben gelegen. Jetzt konnte sie sich bewegen. Mühsam stemmte sie sich hoch.</w:t>
+      </w:r>
+    </w:p>
+    <w:p>
+      <w:pPr>
+        <w:jc w:val="both"/>
+      </w:pPr>
+      <w:r>
+        <w:t>Ein stechender Schmerz fuhr durch ihr Bein. Ihre Rippen protestierten bei jedem Atemzug. Nichts war verheilt. Aber etwas hielt sie aufrecht, das vorher nicht da gewesen war. Sie blickte auf die Männer. Keiner von ihnen bewegte sich. Dann rannte sie.</w:t>
+      </w:r>
+    </w:p>
+    <w:p>
+      <w:pPr>
+        <w:jc w:val="both"/>
+      </w:pPr>
+      <w:r>
+        <w:t>Sie stolperte durch die Gassen, prallte gegen eine Mauer und rappelte sich wieder auf. Jeder Schritt schmerzte. Sie lief trotzdem weiter, fort von den Leichen, fort von den Ratten und fort von etwas, das aus ihr selbst gekommen war. Am nächsten Morgen fand man die beiden Männer tot auf. Ihre Körper wiesen keine neuen sichtbaren Verletzungen auf. Niemand konnte erklären, woran sie gestorben waren.</w:t>
+      </w:r>
+    </w:p>
+    <w:p>
+      <w:pPr>
+        <w:jc w:val="both"/>
+      </w:pPr>
+      <w:r>
+        <w:t>Skarra am allerwenigsten. Später verstand sie mehr. Nicht alles. Die Gabe ließ sich formen. Sie konnte den Tod berühren, wo andere nur sein Ende sahen. Sie lernte aus Versuch und Irrtum, aus Instinkt und einer Wut, die jahrelang keinen Grund fand zu erlöschen.</w:t>
+      </w:r>
+    </w:p>
+    <w:p>
+      <w:pPr>
+        <w:jc w:val="both"/>
+      </w:pPr>
+      <w:r>
+        <w:t>Sie kehrte zu den Menschen zurück, die sie und andere Kinder gequält hatten. Einer nach dem anderen. Sie ließ Schatten in ihren Häusern wachsen und ihre Opfer von Stimmen heimsuchen, die längst hätten schweigen sollen. Manche starben. Andere wünschten es sich, lange bevor es geschah. Es war Rache, und irgendwann war sie weit mehr als das. In den Gassen begann man einen Namen zu flüstern.</w:t>
+      </w:r>
+    </w:p>
+    <w:p>
+      <w:pPr>
+        <w:jc w:val="both"/>
+      </w:pPr>
+      <w:r>
+        <w:t>Schwarzherz. Zuerst hatte sie ihn als Drohung verstanden, die nun endlich von ihr ausging statt gegen sie gerichtet zu sein. Doch Namen hatten die unangenehme Eigenschaft, an einem haften zu bleiben. Und dieser begann eine Frage zu stellen, die sie nicht hören wollte: Wann war aus dem gejagten Kind jemand geworden, vor dem andere Kinder Angst haben mussten? Die Antwort kam mit einem Jungen.</w:t>
       </w:r>
     </w:p>
     <w:p>

</xml_diff>